<commit_message>
docs: publish repo URL and update report/readme/video script for A3
</commit_message>
<xml_diff>
--- a/docs/PROG2002 A3 Report - WU ZhengTao.docx
+++ b/docs/PROG2002 A3 Report - WU ZhengTao.docx
@@ -3017,7 +3017,7 @@
           <w:i w:val="0"/>
           <w:sz w:val="24"/>
         </w:rPr>
-        <w:t>The project reused the HeartBridge client developed in Assignment 2 as the agreed base, which the brief allows by permitting a team to choose one member’s client-side website and extend it. The two members collaborated through a shared private GitHub repository with descriptive, layer-based commits, and each member deploys the applications independently to their own SCU cPanel account as required.</w:t>
+        <w:t>The project reused the HeartBridge client developed in Assignment 2 as the agreed base, which the brief allows by permitting a team to choose one member’s client-side website and extend it. The two members collaborated through a shared GitHub repository with descriptive, layer-based commits, and each member deploys the applications independently to their own SCU cPanel account as required.</w:t>
       </w:r>
     </w:p>
     <w:tbl>
@@ -3317,7 +3317,22 @@
           <w:i w:val="0"/>
           <w:sz w:val="24"/>
         </w:rPr>
-        <w:t>GitHub repository (private, shared with the marker as a collaborator): [INSERT PRIVATE GITHUB REPOSITORY URL]</w:t>
+        <w:t>The complete project source code for the three Node.js applications, the database export and this documentation are maintained in a public GitHub repository with descriptive, layer-based commits. The repository URL is:</w:t>
+      </w:r>
+    </w:p>
+    <w:p>
+      <w:pPr>
+        <w:spacing w:line="360" w:lineRule="auto" w:after="160"/>
+        <w:jc w:val="both"/>
+      </w:pPr>
+      <w:r>
+        <w:rPr>
+          <w:rFonts w:ascii="Consolas" w:hAnsi="Consolas" w:eastAsia="Consolas"/>
+          <w:b w:val="0"/>
+          <w:i w:val="0"/>
+          <w:sz w:val="22"/>
+        </w:rPr>
+        <w:t>https://github.com/asdmwq/Prog2002-A3</w:t>
       </w:r>
     </w:p>
     <w:sectPr>

</xml_diff>